<commit_message>
Made it so yall cant break stuff
</commit_message>
<xml_diff>
--- a/TCA Outreach Bot Documentation.docx
+++ b/TCA Outreach Bot Documentation.docx
@@ -273,7 +273,15 @@
         <w:t>Extensions</w:t>
       </w:r>
       <w:r>
-        <w:t xml:space="preserve"> tab (square icon on the left or press Ctrl+Shift+X).</w:t>
+        <w:t xml:space="preserve"> tab (square icon on the left or press </w:t>
+      </w:r>
+      <w:proofErr w:type="spellStart"/>
+      <w:r>
+        <w:t>Ctrl+Shift+X</w:t>
+      </w:r>
+      <w:proofErr w:type="spellEnd"/>
+      <w:r>
+        <w:t>).</w:t>
       </w:r>
     </w:p>
     <w:p>
@@ -450,7 +458,15 @@
         <w:t xml:space="preserve"> </w:t>
       </w:r>
       <w:r>
-        <w:t>/bin/bash -c "$(curl -fsSL https://raw.githubusercontent.com/Homebrew/install/HEAD/install.sh)"</w:t>
+        <w:t>/bin/bash -c "$(curl -</w:t>
+      </w:r>
+      <w:proofErr w:type="spellStart"/>
+      <w:r>
+        <w:t>fsSL</w:t>
+      </w:r>
+      <w:proofErr w:type="spellEnd"/>
+      <w:r>
+        <w:t xml:space="preserve"> https://raw.githubusercontent.com/Homebrew/install/HEAD/install.sh)"</w:t>
       </w:r>
     </w:p>
     <w:p>
@@ -548,7 +564,15 @@
         <w:t>Extensions</w:t>
       </w:r>
       <w:r>
-        <w:t xml:space="preserve"> tab (square icon on the left or press Cmd+Shift+X).</w:t>
+        <w:t xml:space="preserve"> tab (square icon on the left or press </w:t>
+      </w:r>
+      <w:proofErr w:type="spellStart"/>
+      <w:r>
+        <w:t>Cmd+Shift+X</w:t>
+      </w:r>
+      <w:proofErr w:type="spellEnd"/>
+      <w:r>
+        <w:t>).</w:t>
       </w:r>
     </w:p>
     <w:p>
@@ -716,8 +740,13 @@
         </w:numPr>
       </w:pPr>
       <w:r>
-        <w:t>Then, open the project in VSCode</w:t>
-      </w:r>
+        <w:t xml:space="preserve">Then, open the project in </w:t>
+      </w:r>
+      <w:proofErr w:type="spellStart"/>
+      <w:r>
+        <w:t>VSCode</w:t>
+      </w:r>
+      <w:proofErr w:type="spellEnd"/>
     </w:p>
     <w:p>
       <w:pPr>
@@ -773,7 +802,15 @@
         </w:numPr>
       </w:pPr>
       <w:r>
-        <w:t xml:space="preserve">Next, take the .env file Akshai is putting in the outreach channel in slack, download it, and put it in inside the directory of your git repo alongside your other files </w:t>
+        <w:t xml:space="preserve">Next, take the .env file Akshai is putting in the outreach channel in slack, download it, and put it in inside the directory of your </w:t>
+      </w:r>
+      <w:proofErr w:type="spellStart"/>
+      <w:r>
+        <w:t>git</w:t>
+      </w:r>
+      <w:proofErr w:type="spellEnd"/>
+      <w:r>
+        <w:t xml:space="preserve"> repo alongside your other files </w:t>
       </w:r>
     </w:p>
     <w:p>
@@ -814,7 +851,15 @@
         </w:numPr>
       </w:pPr>
       <w:r>
-        <w:t>Once the project is open in VSCode and you’ve installed the requirements, just open up the company_viewer.py file and hit run</w:t>
+        <w:t xml:space="preserve">Once the project is open in </w:t>
+      </w:r>
+      <w:proofErr w:type="spellStart"/>
+      <w:r>
+        <w:t>VSCode</w:t>
+      </w:r>
+      <w:proofErr w:type="spellEnd"/>
+      <w:r>
+        <w:t xml:space="preserve"> and you’ve installed the requirements, just open up the company_viewer.py file and hit run</w:t>
       </w:r>
     </w:p>
     <w:p>

</xml_diff>